<commit_message>
Renato Russo: Parte 1 reescrita com mais impacto
Co-Authored-By: Claude Opus 5.5 <noreply@anthropic.com>
Claude-Session: https://claude.ai/code/session_01MJjUEEZrxQDEUifKK2vj9g
</commit_message>
<xml_diff>
--- a/roteiros/renato-russo/Renato_Parte1.docx
+++ b/roteiros/renato-russo/Renato_Parte1.docx
@@ -15,7 +15,7 @@
         <w:rPr>
           <w:color w:val="C00000"/>
         </w:rPr>
-        <w:t>Renato Russo morreu à uma e quinze da madrugada, pesando quarenta e cinco quilos. E a mãe dele não estava lá, porque ele mesmo não quis.</w:t>
+        <w:t>Renato Russo passou os últimos meses de vida trancado num apartamento em Ipanema, escondendo do Brasil inteiro a doença que estava devorando o corpo dele. E, na madrugada em que ele morreu, a própria mãe nem sabia que o filho estava morrendo.</w:t>
       </w:r>
     </w:p>
     <w:p>
@@ -23,7 +23,7 @@
         <w:rPr>
           <w:color w:val="C00000"/>
         </w:rPr>
-        <w:t>O que pouca gente sabe é que, meses antes daquela noite, ele tomou uma decisão sombria que ninguém da família conseguiu impedir.</w:t>
+        <w:t>O que pouca gente sabe é que, meses antes daquela noite, ele tomou sozinho uma decisão arrepiante que selou o próprio destino.</w:t>
       </w:r>
     </w:p>
     <w:p>
@@ -31,7 +31,7 @@
         <w:rPr>
           <w:color w:val="C00000"/>
         </w:rPr>
-        <w:t>Fique até o final, porque você vai descobrir a verdade sobre aquela madrugada. E a frase que ele repetia para a mãe nos últimos dias.</w:t>
+        <w:t>Fique até o final, porque você vai descobrir o que aconteceu naquela madrugada de outubro. E a frase que ele repetia para a mãe nos últimos dias, que ela só teve coragem de contar anos depois.</w:t>
       </w:r>
     </w:p>
     <w:p>
@@ -39,7 +39,7 @@
         <w:rPr>
           <w:color w:val="000000"/>
         </w:rPr>
-        <w:t>Para entender por que um dos homens mais amados do Brasil escolheu morrer longe da própria mãe, é preciso voltar a outra cama.</w:t>
+        <w:t>Sexta-feira, onze de outubro de mil novecentos e noventa e seis.</w:t>
       </w:r>
     </w:p>
     <w:p>
@@ -47,7 +47,7 @@
         <w:rPr>
           <w:color w:val="000000"/>
         </w:rPr>
-        <w:t>Uma cama de adolescente, em Brasília, vinte e um anos antes.</w:t>
+        <w:t>Uma e quinze da manhã.</w:t>
       </w:r>
     </w:p>
     <w:p>
@@ -55,7 +55,7 @@
         <w:rPr>
           <w:color w:val="000000"/>
         </w:rPr>
-        <w:t>Só que essa história começa ainda mais cedo.</w:t>
+        <w:t>Num apartamento da Rua Nascimento Silva, em Ipanema, o homem que tinha feito milhões de brasileiros cantarem Pais e Filhos estava deitado numa cama, pesando quarenta e cinco quilos.</w:t>
       </w:r>
     </w:p>
     <w:p>
@@ -63,7 +63,7 @@
         <w:rPr>
           <w:color w:val="000000"/>
         </w:rPr>
-        <w:t>Renato Manfredini Júnior nasceu no Rio de Janeiro, no dia vinte e sete de março de mil novecentos e sessenta.</w:t>
+        <w:t>Ao lado dele, só duas pessoas.</w:t>
       </w:r>
     </w:p>
     <w:p>
@@ -71,7 +71,15 @@
         <w:rPr>
           <w:color w:val="000000"/>
         </w:rPr>
-        <w:t>O pai, Renato Manfredini, era economista e funcionário do Banco do Brasil. A mãe, Maria do Carmo, era professora de inglês. Em casa, todo mundo a chamava de Carminha.</w:t>
+        <w:t>Nenhuma delas era a mãe.</w:t>
+      </w:r>
+    </w:p>
+    <w:p>
+      <w:r>
+        <w:rPr>
+          <w:color w:val="C00000"/>
+        </w:rPr>
+        <w:t>Quem estava naquele quarto, e por que a mãe dele estava em outra cidade, é uma das partes mais dolorosas dessa história. Mas, para entender aquela madrugada, você precisa conhecer outra cama. Vinte e um anos antes.</w:t>
       </w:r>
     </w:p>
     <w:p>
@@ -79,7 +87,7 @@
         <w:rPr>
           <w:color w:val="000000"/>
         </w:rPr>
-        <w:t>Havia ainda uma irmã mais nova, Carmen Teresa.</w:t>
+        <w:t>Brasília, mil novecentos e setenta e cinco.</w:t>
       </w:r>
     </w:p>
     <w:p>
@@ -87,7 +95,7 @@
         <w:rPr>
           <w:color w:val="000000"/>
         </w:rPr>
-        <w:t>Uma família de classe média, organizada, com um pai que mudava de cidade conforme o banco mandava.</w:t>
+        <w:t>Um garoto de quinze anos sente uma dor forte no quadril. Logo, mal consegue andar.</w:t>
       </w:r>
     </w:p>
     <w:p>
@@ -95,7 +103,7 @@
         <w:rPr>
           <w:color w:val="000000"/>
         </w:rPr>
-        <w:t>Em mil novecentos e sessenta e sete, o banco mandou longe.</w:t>
+        <w:t>O diagnóstico é uma doença rara nos ossos, que ataca adolescentes justamente na fase em que o corpo está crescendo.</w:t>
       </w:r>
     </w:p>
     <w:p>
@@ -103,7 +111,7 @@
         <w:rPr>
           <w:color w:val="000000"/>
         </w:rPr>
-        <w:t>O pai foi transferido para uma agência em Nova York, no bairro de Forest Hills, no distrito do Queens. E a família inteira foi junto.</w:t>
+        <w:t>Durante meses, aquele garoto fica preso entre uma cama e uma cadeira de rodas.</w:t>
       </w:r>
     </w:p>
     <w:p>
@@ -111,7 +119,7 @@
         <w:rPr>
           <w:color w:val="000000"/>
         </w:rPr>
-        <w:t>Imagine um menino de sete anos, saído do Rio, de repente morando nos Estados Unidos do fim dos anos sessenta. Outra língua na escola e outra música tocando no rádio.</w:t>
+        <w:t>Os amigos estão na rua, nas festas, no primeiro namoro. Ele está deitado num quarto, olhando para o teto.</w:t>
       </w:r>
     </w:p>
     <w:p>
@@ -119,7 +127,7 @@
         <w:rPr>
           <w:color w:val="000000"/>
         </w:rPr>
-        <w:t>Renato aprendeu inglês ainda criança. Esse inglês ia ficar com ele para sempre. Ia aparecer nas canções e até no nome que ele um dia ia inventar para si mesmo.</w:t>
+        <w:t>O nome dele era Renato Manfredini Júnior.</w:t>
       </w:r>
     </w:p>
     <w:p>
@@ -127,7 +135,15 @@
         <w:rPr>
           <w:color w:val="000000"/>
         </w:rPr>
-        <w:t>A família voltou ao Brasil pouco tempo depois.</w:t>
+        <w:t>O Brasil ainda ia conhecê-lo por outro nome.</w:t>
+      </w:r>
+    </w:p>
+    <w:p>
+      <w:r>
+        <w:rPr>
+          <w:color w:val="C00000"/>
+        </w:rPr>
+        <w:t>O que esse garoto fez naquela cama, preso, sem poder sair de casa, é a primeira pista do segredo que ele ia guardar até o fim da vida. Porque foi ali que ele aprendeu a viver duas vidas ao mesmo tempo.</w:t>
       </w:r>
     </w:p>
     <w:p>
@@ -135,7 +151,7 @@
         <w:rPr>
           <w:color w:val="000000"/>
         </w:rPr>
-        <w:t>Em mil novecentos e setenta e três, veio a mudança que marcou a vida dele. Brasília.</w:t>
+        <w:t>Deitado, Renato começou a escrever em cadernos.</w:t>
       </w:r>
     </w:p>
     <w:p>
@@ -143,7 +159,7 @@
         <w:rPr>
           <w:color w:val="000000"/>
         </w:rPr>
-        <w:t>A capital tinha pouco mais de dez anos. Era uma cidade nova, planejada, cheia de espaços vazios, onde os filhos de funcionários públicos cresciam entre prédios iguais e longas avenidas sem esquinas.</w:t>
+        <w:t>Neles, inventou uma banda de rock que nunca existiu. Deu um nome em inglês para ela, 42nd Street Band. Escreveu a história inteira do grupo. Os discos, as turnês, as brigas, as críticas nos jornais.</w:t>
       </w:r>
     </w:p>
     <w:p>
@@ -151,7 +167,71 @@
         <w:rPr>
           <w:color w:val="000000"/>
         </w:rPr>
-        <w:t>Para um adolescente que gostava de livros e música, Brasília podia ser um lugar muito solitário.</w:t>
+        <w:t>Inventou também um astro para comandar essa banda. Um músico chamado Eric Russell.</w:t>
+      </w:r>
+    </w:p>
+    <w:p>
+      <w:r>
+        <w:rPr>
+          <w:color w:val="000000"/>
+        </w:rPr>
+        <w:t>Pense nessa imagem.</w:t>
+      </w:r>
+    </w:p>
+    <w:p>
+      <w:r>
+        <w:rPr>
+          <w:color w:val="000000"/>
+        </w:rPr>
+        <w:t>Um garoto com o corpo travado, num quarto em Brasília, escrevendo com detalhes a vida de um astro do rock que ele queria ser.</w:t>
+      </w:r>
+    </w:p>
+    <w:p>
+      <w:r>
+        <w:rPr>
+          <w:color w:val="000000"/>
+        </w:rPr>
+        <w:t>Do lado de fora, Renato, o menino doente que a família via deitado.</w:t>
+      </w:r>
+    </w:p>
+    <w:p>
+      <w:r>
+        <w:rPr>
+          <w:color w:val="000000"/>
+        </w:rPr>
+        <w:t>Dentro dos cadernos, Eric, o ídolo que ninguém conhecia.</w:t>
+      </w:r>
+    </w:p>
+    <w:p>
+      <w:r>
+        <w:rPr>
+          <w:color w:val="000000"/>
+        </w:rPr>
+        <w:t>Guarde esses cadernos.</w:t>
+      </w:r>
+    </w:p>
+    <w:p>
+      <w:r>
+        <w:rPr>
+          <w:color w:val="000000"/>
+        </w:rPr>
+        <w:t>Porque esse foi o primeiro de muitos mundos que Renato Russo construiu longe dos olhos de todo mundo. E o último deles, quase vinte anos depois, ia ser um apartamento fechado em Ipanema, onde ele escondeu do país inteiro aquilo que estava acontecendo com ele.</w:t>
+      </w:r>
+    </w:p>
+    <w:p>
+      <w:r>
+        <w:rPr>
+          <w:color w:val="000000"/>
+        </w:rPr>
+        <w:t>Renato não tinha nascido em Brasília.</w:t>
+      </w:r>
+    </w:p>
+    <w:p>
+      <w:r>
+        <w:rPr>
+          <w:color w:val="000000"/>
+        </w:rPr>
+        <w:t>Ele nasceu no Rio de Janeiro, em vinte e sete de março de mil novecentos e sessenta. O pai, Renato Manfredini, era economista do Banco do Brasil. A mãe, Maria do Carmo, era professora de inglês. Em casa, todo mundo a chamava de Carminha.</w:t>
       </w:r>
     </w:p>
     <w:p>
@@ -159,7 +239,7 @@
         <w:rPr>
           <w:color w:val="C00000"/>
         </w:rPr>
-        <w:t>Guarde essa cidade. Porque foi em Brasília que Renato Russo virou quem ele foi. E foi em Brasília que, anos depois, a Legião Urbana fez o último show na cidade, depois de uma das noites mais assustadoras da história do rock brasileiro.</w:t>
+        <w:t>Grave bem esses dois nomes. Porque, no fim da vida, Renato ia fazer ao pai um pedido que o pai nunca imaginou ouvir. E ia esconder da mãe a verdade até o último dia.</w:t>
       </w:r>
     </w:p>
     <w:p>
@@ -167,7 +247,7 @@
         <w:rPr>
           <w:color w:val="000000"/>
         </w:rPr>
-        <w:t>Aos quinze anos, aconteceu a primeira tragédia da vida dele.</w:t>
+        <w:t>Por causa do trabalho do pai, a família viveu dois anos em Nova York, no fim dos anos sessenta. Foi lá que o menino aprendeu inglês, ainda criança.</w:t>
       </w:r>
     </w:p>
     <w:p>
@@ -175,7 +255,7 @@
         <w:rPr>
           <w:color w:val="000000"/>
         </w:rPr>
-        <w:t>Renato começou a sentir dores fortes. O diagnóstico foi uma doença rara nos ossos, que atinge a região do quadril em adolescentes.</w:t>
+        <w:t>Em mil novecentos e setenta e três, a família se mudou para Brasília. Uma cidade nova, planejada, de avenidas largas e prédios iguais. Um lugar onde um adolescente que gostava de livros e de música podia se sentir muito sozinho.</w:t>
       </w:r>
     </w:p>
     <w:p>
@@ -183,7 +263,7 @@
         <w:rPr>
           <w:color w:val="000000"/>
         </w:rPr>
-        <w:t>O tratamento foi duro.</w:t>
+        <w:t>Dois anos depois, veio a cama.</w:t>
       </w:r>
     </w:p>
     <w:p>
@@ -191,7 +271,7 @@
         <w:rPr>
           <w:color w:val="000000"/>
         </w:rPr>
-        <w:t>Durante meses, o menino ficou preso entre a cama e uma cadeira de rodas.</w:t>
+        <w:t>E, da cama, veio o nome.</w:t>
       </w:r>
     </w:p>
     <w:p>
@@ -199,7 +279,7 @@
         <w:rPr>
           <w:color w:val="000000"/>
         </w:rPr>
-        <w:t>Pense nisso. Aos quinze anos, a idade em que os amigos estão na rua, nas festas, descobrindo a vida, Renato estava deitado num quarto em Brasília, olhando para o teto.</w:t>
+        <w:t>Quando finalmente voltou a andar, Renato passou a assinar de outro jeito. Juntou o sobrenome do filósofo inglês Bertrand Russell com o dos franceses Rousseau, que ele admirava.</w:t>
       </w:r>
     </w:p>
     <w:p>
@@ -207,7 +287,7 @@
         <w:rPr>
           <w:color w:val="000000"/>
         </w:rPr>
-        <w:t>Sem poder sair. Sem poder andar direito.</w:t>
+        <w:t>Renato Russo.</w:t>
       </w:r>
     </w:p>
     <w:p>
@@ -215,7 +295,31 @@
         <w:rPr>
           <w:color w:val="000000"/>
         </w:rPr>
-        <w:t>Foi ali, naquela cama, que ele começou a construir um mundo só dele.</w:t>
+        <w:t>Era como se o menino tivesse saído daquela cama transformado em outra pessoa. A pessoa que ele tinha inventado nos cadernos.</w:t>
+      </w:r>
+    </w:p>
+    <w:p>
+      <w:r>
+        <w:rPr>
+          <w:color w:val="000000"/>
+        </w:rPr>
+        <w:t>No fim dos anos setenta, Brasília tinha um grupo de garotos que ouviam punk rock em discos importados e fitas copiadas. Muitos eram filhos de diplomatas e de funcionários públicos. Garotos entediados numa cidade que parecia não ter nada para eles.</w:t>
+      </w:r>
+    </w:p>
+    <w:p>
+      <w:r>
+        <w:rPr>
+          <w:color w:val="000000"/>
+        </w:rPr>
+        <w:t>Renato se juntou a eles.</w:t>
+      </w:r>
+    </w:p>
+    <w:p>
+      <w:r>
+        <w:rPr>
+          <w:color w:val="000000"/>
+        </w:rPr>
+        <w:t>Tinha dezoito anos e uma certeza. Ia viver de música.</w:t>
       </w:r>
     </w:p>
     <w:p>
@@ -223,175 +327,7 @@
         <w:rPr>
           <w:color w:val="C00000"/>
         </w:rPr>
-        <w:t>O que ele criou naquele quarto, deitado, sem poder andar, explica muita coisa sobre o homem que ele virou. Inclusive a capacidade de esconder do mundo inteiro aquilo que não queria mostrar.</w:t>
-      </w:r>
-    </w:p>
-    <w:p>
-      <w:r>
-        <w:rPr>
-          <w:color w:val="000000"/>
-        </w:rPr>
-        <w:t>Renato inventou uma banda.</w:t>
-      </w:r>
-    </w:p>
-    <w:p>
-      <w:r>
-        <w:rPr>
-          <w:color w:val="000000"/>
-        </w:rPr>
-        <w:t>Uma banda que nunca existiu, a não ser na cabeça dele e nos cadernos onde ele escrevia. Ele deu um nome a ela. 42nd Street Band.</w:t>
-      </w:r>
-    </w:p>
-    <w:p>
-      <w:r>
-        <w:rPr>
-          <w:color w:val="000000"/>
-        </w:rPr>
-        <w:t>Nos cadernos, ele escrevia a história completa do grupo. Os integrantes, os discos lançados, as turnês, as brigas, as críticas da imprensa.</w:t>
-      </w:r>
-    </w:p>
-    <w:p>
-      <w:r>
-        <w:rPr>
-          <w:color w:val="000000"/>
-        </w:rPr>
-        <w:t>Criou também um personagem para si mesmo. Um músico chamado Eric Russell, a estrela daquela banda imaginária.</w:t>
-      </w:r>
-    </w:p>
-    <w:p>
-      <w:r>
-        <w:rPr>
-          <w:color w:val="000000"/>
-        </w:rPr>
-        <w:t>Imagine esse menino. Deitado, com o corpo travado, escrevendo em inglês a biografia de um astro do rock que ele gostaria de ser.</w:t>
-      </w:r>
-    </w:p>
-    <w:p>
-      <w:r>
-        <w:rPr>
-          <w:color w:val="000000"/>
-        </w:rPr>
-        <w:t>Do lado de fora da cama, Renato Manfredini Júnior.</w:t>
-      </w:r>
-    </w:p>
-    <w:p>
-      <w:r>
-        <w:rPr>
-          <w:color w:val="000000"/>
-        </w:rPr>
-        <w:t>Do lado de dentro dos cadernos, Eric Russell.</w:t>
-      </w:r>
-    </w:p>
-    <w:p>
-      <w:r>
-        <w:rPr>
-          <w:color w:val="000000"/>
-        </w:rPr>
-        <w:t>Desde muito cedo, ele aprendeu a viver duas vidas ao mesmo tempo.</w:t>
-      </w:r>
-    </w:p>
-    <w:p>
-      <w:r>
-        <w:rPr>
-          <w:color w:val="000000"/>
-        </w:rPr>
-        <w:t>Uma que o mundo via. E outra que só ele conhecia.</w:t>
-      </w:r>
-    </w:p>
-    <w:p>
-      <w:r>
-        <w:rPr>
-          <w:color w:val="C00000"/>
-        </w:rPr>
-        <w:t>Repare nesse padrão, porque ele vai voltar. Duas vidas, uma pública e outra escondida. Quinze anos depois, esse mesmo homem ia guardar um segredo muito mais pesado do que uma banda imaginária. E ia sustentar esse segredo diante de todo o Brasil até o último dia.</w:t>
-      </w:r>
-    </w:p>
-    <w:p>
-      <w:r>
-        <w:rPr>
-          <w:color w:val="000000"/>
-        </w:rPr>
-        <w:t>Renato se recuperou.</w:t>
-      </w:r>
-    </w:p>
-    <w:p>
-      <w:r>
-        <w:rPr>
-          <w:color w:val="000000"/>
-        </w:rPr>
-        <w:t>Voltou a andar e voltou para a escola.</w:t>
-      </w:r>
-    </w:p>
-    <w:p>
-      <w:r>
-        <w:rPr>
-          <w:color w:val="000000"/>
-        </w:rPr>
-        <w:t>Daquela cama, ele trouxe uma coisa que nunca mais largou. A certeza de que queria viver de música.</w:t>
-      </w:r>
-    </w:p>
-    <w:p>
-      <w:r>
-        <w:rPr>
-          <w:color w:val="000000"/>
-        </w:rPr>
-        <w:t>Trouxe também um novo nome.</w:t>
-      </w:r>
-    </w:p>
-    <w:p>
-      <w:r>
-        <w:rPr>
-          <w:color w:val="000000"/>
-        </w:rPr>
-        <w:t>Ele passou a assinar Renato Russo. Era uma homenagem a dois sobrenomes que ele admirava. O do filósofo inglês Bertrand Russell, e o dos franceses Rousseau, o pintor Henri e o filósofo Jean-Jacques.</w:t>
-      </w:r>
-    </w:p>
-    <w:p>
-      <w:r>
-        <w:rPr>
-          <w:color w:val="000000"/>
-        </w:rPr>
-        <w:t>Russell, Rousseau. Russo.</w:t>
-      </w:r>
-    </w:p>
-    <w:p>
-      <w:r>
-        <w:rPr>
-          <w:color w:val="000000"/>
-        </w:rPr>
-        <w:t>O menino da cama tinha escolhido o próprio nome. E, com ele, o tipo de homem que queria ser.</w:t>
-      </w:r>
-    </w:p>
-    <w:p>
-      <w:r>
-        <w:rPr>
-          <w:color w:val="000000"/>
-        </w:rPr>
-        <w:t>Em Brasília, no fim dos anos setenta, um grupo de adolescentes começava a ouvir punk rock. Discos importados e fitas copiadas passavam de mão em mão.</w:t>
-      </w:r>
-    </w:p>
-    <w:p>
-      <w:r>
-        <w:rPr>
-          <w:color w:val="000000"/>
-        </w:rPr>
-        <w:t>Renato estava no meio deles.</w:t>
-      </w:r>
-    </w:p>
-    <w:p>
-      <w:r>
-        <w:rPr>
-          <w:color w:val="000000"/>
-        </w:rPr>
-        <w:t>Ele tinha dezoito anos. Ainda não tinha banda de verdade, nem palco, nem nada.</w:t>
-      </w:r>
-    </w:p>
-    <w:p>
-      <w:r>
-        <w:rPr>
-          <w:color w:val="C00000"/>
-        </w:rPr>
-        <w:t>Mas ali, entre aqueles garotos de Brasília, ia nascer a banda que ia fazer milhões de brasileiros chorarem. E, junto com ela, uma fama que ia cobrar dele um preço terrível. Um preço que ele pagou sozinho, num apartamento em Ipanema, quase vinte anos depois.</w:t>
+        <w:t>Ninguém naquele grupo de garotos de Brasília imaginava o que estava por vir. Em poucos anos, aquele rapaz magro ia lotar estádios pelo Brasil inteiro. E ia viver, no palco, uma noite tão violenta que a banda dele nunca mais voltou a tocar na cidade onde tudo começou.</w:t>
       </w:r>
     </w:p>
     <w:sectPr>

</xml_diff>

<commit_message>
Renato Russo: gancho em estilo de pergunta direta
Co-Authored-By: Claude Opus 5.5 <noreply@anthropic.com>
Claude-Session: https://claude.ai/code/session_01MJjUEEZrxQDEUifKK2vj9g
</commit_message>
<xml_diff>
--- a/roteiros/renato-russo/Renato_Parte1.docx
+++ b/roteiros/renato-russo/Renato_Parte1.docx
@@ -15,7 +15,7 @@
         <w:rPr>
           <w:color w:val="C00000"/>
         </w:rPr>
-        <w:t>Renato Russo passou os últimos meses de vida trancado num apartamento em Ipanema, escondendo do Brasil inteiro a doença que estava devorando o corpo dele. E, na madrugada em que ele morreu, a própria mãe nem sabia que o filho estava morrendo.</w:t>
+        <w:t>Por que Renato Russo, um dos homens mais amados do Brasil, escolheu morrer longe da própria mãe?</w:t>
       </w:r>
     </w:p>
     <w:p>
@@ -23,7 +23,7 @@
         <w:rPr>
           <w:color w:val="C00000"/>
         </w:rPr>
-        <w:t>O que pouca gente sabe é que, meses antes daquela noite, ele tomou sozinho uma decisão arrepiante que selou o próprio destino.</w:t>
+        <w:t>Trinta anos depois, pouca gente sabe o que realmente aconteceu naquela madrugada, dentro de um apartamento em Ipanema. E quase ninguém sabe da decisão que ele tomou sozinho, meses antes, e que nenhuma pessoa da família conseguiu desfazer.</w:t>
       </w:r>
     </w:p>
     <w:p>
@@ -31,7 +31,7 @@
         <w:rPr>
           <w:color w:val="C00000"/>
         </w:rPr>
-        <w:t>Fique até o final, porque você vai descobrir o que aconteceu naquela madrugada de outubro. E a frase que ele repetia para a mãe nos últimos dias, que ela só teve coragem de contar anos depois.</w:t>
+        <w:t>Fique até o final, porque hoje você vai descobrir a verdade sobre a noite em que Renato Russo morreu. E a frase que ele repetia para a mãe nos últimos dias.</w:t>
       </w:r>
     </w:p>
     <w:p>

</xml_diff>

<commit_message>
Renato Russo: Parte 1 no novo eixo (o legado sumindo)
Co-Authored-By: Claude Opus 5.5 <noreply@anthropic.com>
Claude-Session: https://claude.ai/code/session_01MJjUEEZrxQDEUifKK2vj9g
</commit_message>
<xml_diff>
--- a/roteiros/renato-russo/Renato_Parte1.docx
+++ b/roteiros/renato-russo/Renato_Parte1.docx
@@ -7,7 +7,7 @@
         <w:pStyle w:val="Heading1"/>
       </w:pPr>
       <w:r>
-        <w:t>Por que Renato Russo Parou o Remédio Que o Mantinha Vivo — Parte 1</w:t>
+        <w:t>Assim FOI a VIDA de RENATO RUSSO: Por que o Seu Legado Está Sumindo? — Parte 1</w:t>
       </w:r>
     </w:p>
     <w:p>
@@ -15,7 +15,7 @@
         <w:rPr>
           <w:color w:val="C00000"/>
         </w:rPr>
-        <w:t>Por que Renato Russo, um dos homens mais amados do Brasil, escolheu morrer longe da própria mãe?</w:t>
+        <w:t>Renato Russo morreu há quase trinta anos. E, em dezembro de dois mil e vinte, a polícia do Rio de Janeiro precisou entrar num depósito na Zona Norte da cidade para recuperar noventa e uma fitas ligadas a ele.</w:t>
       </w:r>
     </w:p>
     <w:p>
@@ -23,7 +23,7 @@
         <w:rPr>
           <w:color w:val="C00000"/>
         </w:rPr>
-        <w:t>Trinta anos depois, pouca gente sabe o que realmente aconteceu naquela madrugada, dentro de um apartamento em Ipanema. E quase ninguém sabe da decisão que ele tomou sozinho, meses antes, e que nenhuma pessoa da família conseguiu desfazer.</w:t>
+        <w:t>O que pouca gente sabe é que essas fitas são só uma parte da guerra sombria que se formou em volta da obra dele. Processos na Justiça, uma homenagem proibida e a suspeita de um desvio de vinte milhões de reais.</w:t>
       </w:r>
     </w:p>
     <w:p>
@@ -31,7 +31,7 @@
         <w:rPr>
           <w:color w:val="C00000"/>
         </w:rPr>
-        <w:t>Fique até o final, porque hoje você vai descobrir a verdade sobre a noite em que Renato Russo morreu. E a frase que ele repetia para a mãe nos últimos dias.</w:t>
+        <w:t>Fique até o final, porque você vai descobrir por que o legado de Renato Russo está sumindo. E o segredo que ele mesmo escondeu até da própria mãe, até a madrugada em que morreu.</w:t>
       </w:r>
     </w:p>
     <w:p>
@@ -39,7 +39,7 @@
         <w:rPr>
           <w:color w:val="000000"/>
         </w:rPr>
-        <w:t>Sexta-feira, onze de outubro de mil novecentos e noventa e seis.</w:t>
+        <w:t>Para entender como a obra de um dos homens mais amados do Brasil foi parar dentro de um depósito, é preciso voltar a um quarto em Brasília.</w:t>
       </w:r>
     </w:p>
     <w:p>
@@ -47,39 +47,7 @@
         <w:rPr>
           <w:color w:val="000000"/>
         </w:rPr>
-        <w:t>Uma e quinze da manhã.</w:t>
-      </w:r>
-    </w:p>
-    <w:p>
-      <w:r>
-        <w:rPr>
-          <w:color w:val="000000"/>
-        </w:rPr>
-        <w:t>Num apartamento da Rua Nascimento Silva, em Ipanema, o homem que tinha feito milhões de brasileiros cantarem Pais e Filhos estava deitado numa cama, pesando quarenta e cinco quilos.</w:t>
-      </w:r>
-    </w:p>
-    <w:p>
-      <w:r>
-        <w:rPr>
-          <w:color w:val="000000"/>
-        </w:rPr>
-        <w:t>Ao lado dele, só duas pessoas.</w:t>
-      </w:r>
-    </w:p>
-    <w:p>
-      <w:r>
-        <w:rPr>
-          <w:color w:val="000000"/>
-        </w:rPr>
-        <w:t>Nenhuma delas era a mãe.</w:t>
-      </w:r>
-    </w:p>
-    <w:p>
-      <w:r>
-        <w:rPr>
-          <w:color w:val="C00000"/>
-        </w:rPr>
-        <w:t>Quem estava naquele quarto, e por que a mãe dele estava em outra cidade, é uma das partes mais dolorosas dessa história. Mas, para entender aquela madrugada, você precisa conhecer outra cama. Vinte e um anos antes.</w:t>
+        <w:t>E a um garoto que, aos quinze anos, aprendeu a esconder do mundo a vida que levava por dentro.</w:t>
       </w:r>
     </w:p>
     <w:p>
@@ -119,7 +87,7 @@
         <w:rPr>
           <w:color w:val="000000"/>
         </w:rPr>
-        <w:t>Os amigos estão na rua, nas festas, no primeiro namoro. Ele está deitado num quarto, olhando para o teto.</w:t>
+        <w:t>Os amigos estão na rua e nas festas, vivendo o primeiro namoro. Ele está deitado num quarto, olhando para o teto.</w:t>
       </w:r>
     </w:p>
     <w:p>
@@ -215,7 +183,15 @@
         <w:rPr>
           <w:color w:val="000000"/>
         </w:rPr>
-        <w:t>Porque esse foi o primeiro de muitos mundos que Renato Russo construiu longe dos olhos de todo mundo. E o último deles, quase vinte anos depois, ia ser um apartamento fechado em Ipanema, onde ele escondeu do país inteiro aquilo que estava acontecendo com ele.</w:t>
+        <w:t>Porque esses cadernos foram o começo de um hábito que ele levou para a vida inteira. Renato escrevia e guardava quase tudo. Cadernos, diários, letras e gravações.</w:t>
+      </w:r>
+    </w:p>
+    <w:p>
+      <w:r>
+        <w:rPr>
+          <w:color w:val="000000"/>
+        </w:rPr>
+        <w:t>Quando ele morreu, esse material virou um acervo com mais de seis mil objetos. E boa parte dele passou quase três décadas longe dos olhos do público.</w:t>
       </w:r>
     </w:p>
     <w:p>
@@ -239,7 +215,7 @@
         <w:rPr>
           <w:color w:val="C00000"/>
         </w:rPr>
-        <w:t>Grave bem esses dois nomes. Porque, no fim da vida, Renato ia fazer ao pai um pedido que o pai nunca imaginou ouvir. E ia esconder da mãe a verdade até o último dia.</w:t>
+        <w:t>Grave bem esses dois nomes. Porque, no fim da vida, Renato ia fazer ao pai um pedido que o pai nunca imaginou ouvir. E ia esconder da mãe uma verdade sombria até o último dia.</w:t>
       </w:r>
     </w:p>
     <w:p>
@@ -327,7 +303,7 @@
         <w:rPr>
           <w:color w:val="C00000"/>
         </w:rPr>
-        <w:t>Ninguém naquele grupo de garotos de Brasília imaginava o que estava por vir. Em poucos anos, aquele rapaz magro ia lotar estádios pelo Brasil inteiro. E ia viver, no palco, uma noite tão violenta que a banda dele nunca mais voltou a tocar na cidade onde tudo começou.</w:t>
+        <w:t>Ninguém naquele grupo de garotos de Brasília imaginava o que estava por vir. Em poucos anos, aquele rapaz magro ia lotar estádios pelo Brasil inteiro. E ia viver, no palco, uma noite tão violenta que a banda dele nunca mais voltou a tocar na cidade onde tudo começou. Mas, antes disso, ele ia criar uma coisa que, décadas depois, virou o centro de uma guerra na Justiça. Um nome.</w:t>
       </w:r>
     </w:p>
     <w:sectPr>

</xml_diff>

<commit_message>
Renato Russo: revisão da Parte 1 (gancho, listas de três, origem do nome)
Co-Authored-By: Claude Opus 5.5 <noreply@anthropic.com>
Claude-Session: https://claude.ai/code/session_01MJjUEEZrxQDEUifKK2vj9g
</commit_message>
<xml_diff>
--- a/roteiros/renato-russo/Renato_Parte1.docx
+++ b/roteiros/renato-russo/Renato_Parte1.docx
@@ -15,7 +15,7 @@
         <w:rPr>
           <w:color w:val="C00000"/>
         </w:rPr>
-        <w:t>Renato Russo morreu há quase trinta anos. E, em dezembro de dois mil e vinte, a polícia do Rio de Janeiro precisou entrar num depósito na Zona Norte da cidade para recuperar noventa e uma fitas ligadas a ele.</w:t>
+        <w:t>Renato Russo morreu há quase trinta anos. Mas, em dezembro de dois mil e vinte, a polícia do Rio de Janeiro precisou entrar num depósito na Zona Norte da cidade para recuperar noventa e uma fitas ligadas a ele.</w:t>
       </w:r>
     </w:p>
     <w:p>
@@ -23,7 +23,7 @@
         <w:rPr>
           <w:color w:val="C00000"/>
         </w:rPr>
-        <w:t>O que pouca gente sabe é que essas fitas são só uma parte da guerra sombria que se formou em volta da obra dele. Processos na Justiça, uma homenagem proibida e a suspeita de um desvio de vinte milhões de reais.</w:t>
+        <w:t>O que pouca gente sabe é que essas fitas são só uma parte da guerra sombria que se formou em volta da obra dele. Uma briga na Justiça que se arrasta há anos. E a suspeita de um desvio de vinte milhões de reais.</w:t>
       </w:r>
     </w:p>
     <w:p>
@@ -87,7 +87,7 @@
         <w:rPr>
           <w:color w:val="000000"/>
         </w:rPr>
-        <w:t>Os amigos estão na rua e nas festas, vivendo o primeiro namoro. Ele está deitado num quarto, olhando para o teto.</w:t>
+        <w:t>Os amigos estão na rua, vivendo o primeiro namoro. Ele está deitado num quarto, olhando para o teto.</w:t>
       </w:r>
     </w:p>
     <w:p>
@@ -183,7 +183,7 @@
         <w:rPr>
           <w:color w:val="000000"/>
         </w:rPr>
-        <w:t>Porque esses cadernos foram o começo de um hábito que ele levou para a vida inteira. Renato escrevia e guardava quase tudo. Cadernos, diários, letras e gravações.</w:t>
+        <w:t>Porque esses cadernos foram o começo de um hábito que ele levou para a vida inteira. Renato escrevia e guardava quase tudo. Guardava letras e diários. Guardava fitas com gravações.</w:t>
       </w:r>
     </w:p>
     <w:p>
@@ -247,7 +247,7 @@
         <w:rPr>
           <w:color w:val="000000"/>
         </w:rPr>
-        <w:t>E, da cama, veio o nome.</w:t>
+        <w:t>E foi daquela cama que nasceu o nome.</w:t>
       </w:r>
     </w:p>
     <w:p>
@@ -255,7 +255,15 @@
         <w:rPr>
           <w:color w:val="000000"/>
         </w:rPr>
-        <w:t>Quando finalmente voltou a andar, Renato passou a assinar de outro jeito. Juntou o sobrenome do filósofo inglês Bertrand Russell com o dos franceses Rousseau, que ele admirava.</w:t>
+        <w:t>Russell era o sobrenome do astro inventado nos cadernos. Era também o do filósofo inglês Bertrand Russell, que ele lia. E lembrava Rousseau, do filósofo Jean-Jacques e do pintor Henri, que ele também admirava.</w:t>
+      </w:r>
+    </w:p>
+    <w:p>
+      <w:r>
+        <w:rPr>
+          <w:color w:val="000000"/>
+        </w:rPr>
+        <w:t>Quando voltou a andar, Renato passou a assinar de outro jeito.</w:t>
       </w:r>
     </w:p>
     <w:p>

</xml_diff>